<commit_message>
docs: tim hieu ve RGW
</commit_message>
<xml_diff>
--- a/MOP/MOP.docx
+++ b/MOP/MOP.docx
@@ -6,9 +6,18 @@
       <w:pPr>
         <w:pStyle w:val="Heading1"/>
         <w:jc w:val="center"/>
+        <w:rPr>
+          <w:lang w:val="vi-VN"/>
+        </w:rPr>
       </w:pPr>
       <w:r>
         <w:t>MOP</w:t>
+      </w:r>
+      <w:r>
+        <w:rPr>
+          <w:lang w:val="vi-VN"/>
+        </w:rPr>
+        <w:t xml:space="preserve"> PA1</w:t>
       </w:r>
     </w:p>
     <w:p>
@@ -1797,47 +1806,855 @@
       <w:pPr>
         <w:ind w:left="360"/>
         <w:rPr>
+          <w:rFonts w:ascii="Courier New" w:eastAsia="Times New Roman" w:hAnsi="Courier New" w:cs="Courier New"/>
+          <w:kern w:val="0"/>
+          <w:sz w:val="20"/>
+          <w:szCs w:val="20"/>
+          <w14:ligatures w14:val="none"/>
+        </w:rPr>
+      </w:pPr>
+      <w:proofErr w:type="gramStart"/>
+      <w:r>
+        <w:rPr>
+          <w:rFonts w:ascii="Times New Roman" w:eastAsia="Times New Roman" w:hAnsi="Symbol" w:cs="Times New Roman"/>
+          <w:kern w:val="0"/>
+          <w14:ligatures w14:val="none"/>
+        </w:rPr>
+        <w:t></w:t>
+      </w:r>
+      <w:r>
+        <w:rPr>
+          <w:rFonts w:ascii="Times New Roman" w:eastAsia="Times New Roman" w:hAnsi="Times New Roman" w:cs="Times New Roman"/>
+          <w:kern w:val="0"/>
+          <w14:ligatures w14:val="none"/>
+        </w:rPr>
+        <w:t xml:space="preserve">  </w:t>
+      </w:r>
+      <w:r>
+        <w:rPr>
+          <w:rFonts w:ascii="Courier New" w:eastAsia="Times New Roman" w:hAnsi="Courier New" w:cs="Courier New"/>
+          <w:kern w:val="0"/>
+          <w:sz w:val="20"/>
+          <w:szCs w:val="20"/>
+          <w14:ligatures w14:val="none"/>
+        </w:rPr>
+        <w:t>ceph</w:t>
+      </w:r>
+      <w:proofErr w:type="gramEnd"/>
+      <w:r>
+        <w:rPr>
+          <w:rFonts w:ascii="Courier New" w:eastAsia="Times New Roman" w:hAnsi="Courier New" w:cs="Courier New"/>
+          <w:kern w:val="0"/>
+          <w:sz w:val="20"/>
+          <w:szCs w:val="20"/>
+          <w14:ligatures w14:val="none"/>
+        </w:rPr>
+        <w:t xml:space="preserve"> osd pool ls detail</w:t>
+      </w:r>
+    </w:p>
+    <w:p>
+      <w:pPr>
+        <w:pStyle w:val="Heading2"/>
+        <w:numPr>
+          <w:ilvl w:val="0"/>
+          <w:numId w:val="1"/>
+        </w:numPr>
+        <w:rPr>
+          <w:rFonts w:eastAsia="Times New Roman"/>
           <w:lang w:val="vi-VN"/>
         </w:rPr>
       </w:pPr>
-      <w:proofErr w:type="gramStart"/>
-      <w:r>
-        <w:rPr>
-          <w:rFonts w:ascii="Times New Roman" w:eastAsia="Times New Roman" w:hAnsi="Symbol" w:cs="Times New Roman"/>
-          <w:kern w:val="0"/>
-          <w14:ligatures w14:val="none"/>
-        </w:rPr>
-        <w:t></w:t>
-      </w:r>
-      <w:r>
-        <w:rPr>
-          <w:rFonts w:ascii="Times New Roman" w:eastAsia="Times New Roman" w:hAnsi="Times New Roman" w:cs="Times New Roman"/>
-          <w:kern w:val="0"/>
-          <w14:ligatures w14:val="none"/>
-        </w:rPr>
-        <w:t xml:space="preserve">  </w:t>
-      </w:r>
-      <w:r>
-        <w:rPr>
-          <w:rFonts w:ascii="Courier New" w:eastAsia="Times New Roman" w:hAnsi="Courier New" w:cs="Courier New"/>
-          <w:kern w:val="0"/>
-          <w:sz w:val="20"/>
-          <w:szCs w:val="20"/>
-          <w14:ligatures w14:val="none"/>
-        </w:rPr>
-        <w:t>ceph</w:t>
-      </w:r>
-      <w:proofErr w:type="gramEnd"/>
-      <w:r>
-        <w:rPr>
-          <w:rFonts w:ascii="Courier New" w:eastAsia="Times New Roman" w:hAnsi="Courier New" w:cs="Courier New"/>
-          <w:kern w:val="0"/>
-          <w:sz w:val="20"/>
-          <w:szCs w:val="20"/>
-          <w14:ligatures w14:val="none"/>
-        </w:rPr>
-        <w:t xml:space="preserve"> osd pool ls detail</w:t>
-      </w:r>
+      <w:r>
+        <w:rPr>
+          <w:rFonts w:eastAsia="Times New Roman"/>
+        </w:rPr>
+        <w:t>Ok</w:t>
+      </w:r>
+      <w:r>
+        <w:rPr>
+          <w:rFonts w:eastAsia="Times New Roman"/>
+          <w:lang w:val="vi-VN"/>
+        </w:rPr>
+        <w:t xml:space="preserve"> to stop </w:t>
+      </w:r>
+    </w:p>
+    <w:p>
+      <w:pPr>
+        <w:pStyle w:val="ListParagraph"/>
+        <w:numPr>
+          <w:ilvl w:val="0"/>
+          <w:numId w:val="2"/>
+        </w:numPr>
+        <w:rPr>
+          <w:rFonts w:ascii="Courier New" w:hAnsi="Courier New" w:cs="Courier New"/>
+          <w:lang w:val="vi-VN"/>
+        </w:rPr>
+      </w:pPr>
+      <w:r>
+        <w:rPr>
+          <w:rFonts w:ascii="Courier New" w:hAnsi="Courier New" w:cs="Courier New"/>
+          <w:lang w:val="vi-VN"/>
+        </w:rPr>
+        <w:t>ceph -s</w:t>
+      </w:r>
+    </w:p>
+    <w:p>
+      <w:pPr>
+        <w:pStyle w:val="ListParagraph"/>
+        <w:numPr>
+          <w:ilvl w:val="0"/>
+          <w:numId w:val="2"/>
+        </w:numPr>
+        <w:rPr>
+          <w:rFonts w:ascii="Courier New" w:hAnsi="Courier New" w:cs="Courier New"/>
+          <w:lang w:val="vi-VN"/>
+        </w:rPr>
+      </w:pPr>
+      <w:r>
+        <w:rPr>
+          <w:rFonts w:ascii="Courier New" w:hAnsi="Courier New" w:cs="Courier New"/>
+          <w:lang w:val="vi-VN"/>
+        </w:rPr>
+        <w:t>ceph osd ok-to-stop 1</w:t>
+      </w:r>
+    </w:p>
+    <w:p>
+      <w:pPr>
+        <w:pStyle w:val="ListParagraph"/>
+        <w:numPr>
+          <w:ilvl w:val="0"/>
+          <w:numId w:val="2"/>
+        </w:numPr>
+        <w:rPr>
+          <w:rFonts w:ascii="Courier New" w:hAnsi="Courier New" w:cs="Courier New"/>
+          <w:lang w:val="vi-VN"/>
+        </w:rPr>
+      </w:pPr>
+      <w:r>
+        <w:rPr>
+          <w:rFonts w:ascii="Courier New" w:hAnsi="Courier New" w:cs="Courier New"/>
+          <w:lang w:val="vi-VN"/>
+        </w:rPr>
+        <w:lastRenderedPageBreak/>
+        <w:t>ceph balancer status</w:t>
+      </w:r>
+    </w:p>
+    <w:p>
+      <w:pPr>
+        <w:pStyle w:val="ListParagraph"/>
+        <w:numPr>
+          <w:ilvl w:val="0"/>
+          <w:numId w:val="2"/>
+        </w:numPr>
+        <w:rPr>
+          <w:rFonts w:ascii="Courier New" w:hAnsi="Courier New" w:cs="Courier New"/>
+          <w:lang w:val="vi-VN"/>
+        </w:rPr>
+      </w:pPr>
+      <w:r>
+        <w:rPr>
+          <w:rFonts w:ascii="Courier New" w:hAnsi="Courier New" w:cs="Courier New"/>
+          <w:lang w:val="vi-VN"/>
+        </w:rPr>
+        <w:t>ceph pg ls-by-osd 1</w:t>
+      </w:r>
+    </w:p>
+    <w:p>
+      <w:pPr>
+        <w:pStyle w:val="ListParagraph"/>
+        <w:numPr>
+          <w:ilvl w:val="0"/>
+          <w:numId w:val="2"/>
+        </w:numPr>
+        <w:rPr>
+          <w:rFonts w:ascii="Courier New" w:hAnsi="Courier New" w:cs="Courier New"/>
+          <w:lang w:val="vi-VN"/>
+        </w:rPr>
+      </w:pPr>
+      <w:r>
+        <w:rPr>
+          <w:rFonts w:ascii="Courier New" w:hAnsi="Courier New" w:cs="Courier New"/>
+          <w:lang w:val="vi-VN"/>
+        </w:rPr>
+        <w:t>ceph pg ls-by-primary 1</w:t>
+      </w:r>
+    </w:p>
+    <w:p>
+      <w:pPr>
+        <w:rPr>
+          <w:rFonts w:asciiTheme="majorHAnsi" w:hAnsiTheme="majorHAnsi" w:cs="Courier New"/>
+          <w:lang w:val="vi-VN"/>
+        </w:rPr>
+      </w:pPr>
+      <w:r>
+        <w:rPr>
+          <w:rFonts w:asciiTheme="majorHAnsi" w:hAnsiTheme="majorHAnsi" w:cs="Courier New"/>
+          <w:lang w:val="vi-VN"/>
+        </w:rPr>
+        <w:t xml:space="preserve">có thể chọn osd.1 làm canary và </w:t>
+      </w:r>
+    </w:p>
+    <w:tbl>
+      <w:tblPr>
+        <w:tblStyle w:val="TableGrid"/>
+        <w:tblW w:w="0" w:type="auto"/>
+        <w:tblLook w:val="04A0" w:firstRow="1" w:lastRow="0" w:firstColumn="1" w:lastColumn="0" w:noHBand="0" w:noVBand="1"/>
+      </w:tblPr>
+      <w:tblGrid>
+        <w:gridCol w:w="778"/>
+        <w:gridCol w:w="900"/>
+        <w:gridCol w:w="593"/>
+        <w:gridCol w:w="1368"/>
+        <w:gridCol w:w="976"/>
+      </w:tblGrid>
+      <w:tr>
+        <w:tc>
+          <w:tcPr>
+            <w:tcW w:w="0" w:type="auto"/>
+            <w:hideMark/>
+          </w:tcPr>
+          <w:p>
+            <w:pPr>
+              <w:spacing w:after="160" w:line="278" w:lineRule="auto"/>
+              <w:rPr>
+                <w:rFonts w:asciiTheme="majorHAnsi" w:hAnsiTheme="majorHAnsi" w:cs="Courier New"/>
+                <w:b/>
+                <w:bCs/>
+              </w:rPr>
+            </w:pPr>
+            <w:r>
+              <w:rPr>
+                <w:rFonts w:asciiTheme="majorHAnsi" w:hAnsiTheme="majorHAnsi" w:cs="Courier New"/>
+                <w:b/>
+                <w:bCs/>
+              </w:rPr>
+              <w:t>OSD</w:t>
+            </w:r>
+          </w:p>
+        </w:tc>
+        <w:tc>
+          <w:tcPr>
+            <w:tcW w:w="0" w:type="auto"/>
+            <w:hideMark/>
+          </w:tcPr>
+          <w:p>
+            <w:pPr>
+              <w:spacing w:after="160" w:line="278" w:lineRule="auto"/>
+              <w:rPr>
+                <w:rFonts w:asciiTheme="majorHAnsi" w:hAnsiTheme="majorHAnsi" w:cs="Courier New"/>
+                <w:b/>
+                <w:bCs/>
+              </w:rPr>
+            </w:pPr>
+            <w:r>
+              <w:rPr>
+                <w:rFonts w:asciiTheme="majorHAnsi" w:hAnsiTheme="majorHAnsi" w:cs="Courier New"/>
+                <w:b/>
+                <w:bCs/>
+              </w:rPr>
+              <w:t>Host</w:t>
+            </w:r>
+          </w:p>
+        </w:tc>
+        <w:tc>
+          <w:tcPr>
+            <w:tcW w:w="0" w:type="auto"/>
+            <w:hideMark/>
+          </w:tcPr>
+          <w:p>
+            <w:pPr>
+              <w:spacing w:after="160" w:line="278" w:lineRule="auto"/>
+              <w:rPr>
+                <w:rFonts w:asciiTheme="majorHAnsi" w:hAnsiTheme="majorHAnsi" w:cs="Courier New"/>
+                <w:b/>
+                <w:bCs/>
+              </w:rPr>
+            </w:pPr>
+            <w:r>
+              <w:rPr>
+                <w:rFonts w:asciiTheme="majorHAnsi" w:hAnsiTheme="majorHAnsi" w:cs="Courier New"/>
+                <w:b/>
+                <w:bCs/>
+              </w:rPr>
+              <w:t>PG</w:t>
+            </w:r>
+          </w:p>
+        </w:tc>
+        <w:tc>
+          <w:tcPr>
+            <w:tcW w:w="0" w:type="auto"/>
+            <w:hideMark/>
+          </w:tcPr>
+          <w:p>
+            <w:pPr>
+              <w:spacing w:after="160" w:line="278" w:lineRule="auto"/>
+              <w:rPr>
+                <w:rFonts w:asciiTheme="majorHAnsi" w:hAnsiTheme="majorHAnsi" w:cs="Courier New"/>
+                <w:b/>
+                <w:bCs/>
+              </w:rPr>
+            </w:pPr>
+            <w:r>
+              <w:rPr>
+                <w:rFonts w:asciiTheme="majorHAnsi" w:hAnsiTheme="majorHAnsi" w:cs="Courier New"/>
+                <w:b/>
+                <w:bCs/>
+              </w:rPr>
+              <w:t>Primary PG</w:t>
+            </w:r>
+          </w:p>
+        </w:tc>
+        <w:tc>
+          <w:tcPr>
+            <w:tcW w:w="0" w:type="auto"/>
+            <w:hideMark/>
+          </w:tcPr>
+          <w:p>
+            <w:pPr>
+              <w:spacing w:after="160" w:line="278" w:lineRule="auto"/>
+              <w:rPr>
+                <w:rFonts w:asciiTheme="majorHAnsi" w:hAnsiTheme="majorHAnsi" w:cs="Courier New"/>
+                <w:b/>
+                <w:bCs/>
+              </w:rPr>
+            </w:pPr>
+            <w:r>
+              <w:rPr>
+                <w:rFonts w:asciiTheme="majorHAnsi" w:hAnsiTheme="majorHAnsi" w:cs="Courier New"/>
+                <w:b/>
+                <w:bCs/>
+              </w:rPr>
+              <w:t>Used</w:t>
+            </w:r>
+          </w:p>
+        </w:tc>
+      </w:tr>
+      <w:tr>
+        <w:tc>
+          <w:tcPr>
+            <w:tcW w:w="0" w:type="auto"/>
+            <w:hideMark/>
+          </w:tcPr>
+          <w:p>
+            <w:pPr>
+              <w:spacing w:after="160" w:line="278" w:lineRule="auto"/>
+              <w:rPr>
+                <w:rFonts w:asciiTheme="majorHAnsi" w:hAnsiTheme="majorHAnsi" w:cs="Courier New"/>
+              </w:rPr>
+            </w:pPr>
+            <w:r>
+              <w:rPr>
+                <w:rFonts w:asciiTheme="majorHAnsi" w:hAnsiTheme="majorHAnsi" w:cs="Courier New"/>
+              </w:rPr>
+              <w:t>osd.0</w:t>
+            </w:r>
+          </w:p>
+        </w:tc>
+        <w:tc>
+          <w:tcPr>
+            <w:tcW w:w="0" w:type="auto"/>
+            <w:hideMark/>
+          </w:tcPr>
+          <w:p>
+            <w:pPr>
+              <w:spacing w:after="160" w:line="278" w:lineRule="auto"/>
+              <w:rPr>
+                <w:rFonts w:asciiTheme="majorHAnsi" w:hAnsiTheme="majorHAnsi" w:cs="Courier New"/>
+              </w:rPr>
+            </w:pPr>
+            <w:r>
+              <w:rPr>
+                <w:rFonts w:asciiTheme="majorHAnsi" w:hAnsiTheme="majorHAnsi" w:cs="Courier New"/>
+              </w:rPr>
+              <w:t>master</w:t>
+            </w:r>
+          </w:p>
+        </w:tc>
+        <w:tc>
+          <w:tcPr>
+            <w:tcW w:w="0" w:type="auto"/>
+            <w:hideMark/>
+          </w:tcPr>
+          <w:p>
+            <w:pPr>
+              <w:spacing w:after="160" w:line="278" w:lineRule="auto"/>
+              <w:rPr>
+                <w:rFonts w:asciiTheme="majorHAnsi" w:hAnsiTheme="majorHAnsi" w:cs="Courier New"/>
+              </w:rPr>
+            </w:pPr>
+            <w:r>
+              <w:rPr>
+                <w:rFonts w:asciiTheme="majorHAnsi" w:hAnsiTheme="majorHAnsi" w:cs="Courier New"/>
+              </w:rPr>
+              <w:t>121</w:t>
+            </w:r>
+          </w:p>
+        </w:tc>
+        <w:tc>
+          <w:tcPr>
+            <w:tcW w:w="0" w:type="auto"/>
+            <w:hideMark/>
+          </w:tcPr>
+          <w:p>
+            <w:pPr>
+              <w:spacing w:after="160" w:line="278" w:lineRule="auto"/>
+              <w:rPr>
+                <w:rFonts w:asciiTheme="majorHAnsi" w:hAnsiTheme="majorHAnsi" w:cs="Courier New"/>
+              </w:rPr>
+            </w:pPr>
+            <w:r>
+              <w:rPr>
+                <w:rFonts w:asciiTheme="majorHAnsi" w:hAnsiTheme="majorHAnsi" w:cs="Courier New"/>
+              </w:rPr>
+              <w:t>51</w:t>
+            </w:r>
+          </w:p>
+        </w:tc>
+        <w:tc>
+          <w:tcPr>
+            <w:tcW w:w="0" w:type="auto"/>
+            <w:hideMark/>
+          </w:tcPr>
+          <w:p>
+            <w:pPr>
+              <w:spacing w:after="160" w:line="278" w:lineRule="auto"/>
+              <w:rPr>
+                <w:rFonts w:asciiTheme="majorHAnsi" w:hAnsiTheme="majorHAnsi" w:cs="Courier New"/>
+              </w:rPr>
+            </w:pPr>
+            <w:r>
+              <w:rPr>
+                <w:rFonts w:asciiTheme="majorHAnsi" w:hAnsiTheme="majorHAnsi" w:cs="Courier New"/>
+              </w:rPr>
+              <w:t>4.47%</w:t>
+            </w:r>
+          </w:p>
+        </w:tc>
+      </w:tr>
+      <w:tr>
+        <w:tc>
+          <w:tcPr>
+            <w:tcW w:w="0" w:type="auto"/>
+            <w:hideMark/>
+          </w:tcPr>
+          <w:p>
+            <w:pPr>
+              <w:spacing w:after="160" w:line="278" w:lineRule="auto"/>
+              <w:rPr>
+                <w:rFonts w:asciiTheme="majorHAnsi" w:hAnsiTheme="majorHAnsi" w:cs="Courier New"/>
+              </w:rPr>
+            </w:pPr>
+            <w:r>
+              <w:rPr>
+                <w:rFonts w:asciiTheme="majorHAnsi" w:hAnsiTheme="majorHAnsi" w:cs="Courier New"/>
+                <w:b/>
+                <w:bCs/>
+              </w:rPr>
+              <w:t>osd.1</w:t>
+            </w:r>
+          </w:p>
+        </w:tc>
+        <w:tc>
+          <w:tcPr>
+            <w:tcW w:w="0" w:type="auto"/>
+            <w:hideMark/>
+          </w:tcPr>
+          <w:p>
+            <w:pPr>
+              <w:spacing w:after="160" w:line="278" w:lineRule="auto"/>
+              <w:rPr>
+                <w:rFonts w:asciiTheme="majorHAnsi" w:hAnsiTheme="majorHAnsi" w:cs="Courier New"/>
+              </w:rPr>
+            </w:pPr>
+            <w:r>
+              <w:rPr>
+                <w:rFonts w:asciiTheme="majorHAnsi" w:hAnsiTheme="majorHAnsi" w:cs="Courier New"/>
+              </w:rPr>
+              <w:t>node2</w:t>
+            </w:r>
+          </w:p>
+        </w:tc>
+        <w:tc>
+          <w:tcPr>
+            <w:tcW w:w="0" w:type="auto"/>
+            <w:hideMark/>
+          </w:tcPr>
+          <w:p>
+            <w:pPr>
+              <w:spacing w:after="160" w:line="278" w:lineRule="auto"/>
+              <w:rPr>
+                <w:rFonts w:asciiTheme="majorHAnsi" w:hAnsiTheme="majorHAnsi" w:cs="Courier New"/>
+              </w:rPr>
+            </w:pPr>
+            <w:r>
+              <w:rPr>
+                <w:rFonts w:asciiTheme="majorHAnsi" w:hAnsiTheme="majorHAnsi" w:cs="Courier New"/>
+                <w:b/>
+                <w:bCs/>
+              </w:rPr>
+              <w:t>99</w:t>
+            </w:r>
+          </w:p>
+        </w:tc>
+        <w:tc>
+          <w:tcPr>
+            <w:tcW w:w="0" w:type="auto"/>
+            <w:hideMark/>
+          </w:tcPr>
+          <w:p>
+            <w:pPr>
+              <w:spacing w:after="160" w:line="278" w:lineRule="auto"/>
+              <w:rPr>
+                <w:rFonts w:asciiTheme="majorHAnsi" w:hAnsiTheme="majorHAnsi" w:cs="Courier New"/>
+              </w:rPr>
+            </w:pPr>
+            <w:r>
+              <w:rPr>
+                <w:rFonts w:asciiTheme="majorHAnsi" w:hAnsiTheme="majorHAnsi" w:cs="Courier New"/>
+                <w:b/>
+                <w:bCs/>
+              </w:rPr>
+              <w:t>34</w:t>
+            </w:r>
+          </w:p>
+        </w:tc>
+        <w:tc>
+          <w:tcPr>
+            <w:tcW w:w="0" w:type="auto"/>
+            <w:hideMark/>
+          </w:tcPr>
+          <w:p>
+            <w:pPr>
+              <w:spacing w:after="160" w:line="278" w:lineRule="auto"/>
+              <w:rPr>
+                <w:rFonts w:asciiTheme="majorHAnsi" w:hAnsiTheme="majorHAnsi" w:cs="Courier New"/>
+              </w:rPr>
+            </w:pPr>
+            <w:r>
+              <w:rPr>
+                <w:rFonts w:asciiTheme="majorHAnsi" w:hAnsiTheme="majorHAnsi" w:cs="Courier New"/>
+                <w:b/>
+                <w:bCs/>
+              </w:rPr>
+              <w:t>4.27%</w:t>
+            </w:r>
+          </w:p>
+        </w:tc>
+      </w:tr>
+      <w:tr>
+        <w:tc>
+          <w:tcPr>
+            <w:tcW w:w="0" w:type="auto"/>
+            <w:hideMark/>
+          </w:tcPr>
+          <w:p>
+            <w:pPr>
+              <w:spacing w:after="160" w:line="278" w:lineRule="auto"/>
+              <w:rPr>
+                <w:rFonts w:asciiTheme="majorHAnsi" w:hAnsiTheme="majorHAnsi" w:cs="Courier New"/>
+              </w:rPr>
+            </w:pPr>
+            <w:r>
+              <w:rPr>
+                <w:rFonts w:asciiTheme="majorHAnsi" w:hAnsiTheme="majorHAnsi" w:cs="Courier New"/>
+              </w:rPr>
+              <w:t>osd.2</w:t>
+            </w:r>
+          </w:p>
+        </w:tc>
+        <w:tc>
+          <w:tcPr>
+            <w:tcW w:w="0" w:type="auto"/>
+            <w:hideMark/>
+          </w:tcPr>
+          <w:p>
+            <w:pPr>
+              <w:spacing w:after="160" w:line="278" w:lineRule="auto"/>
+              <w:rPr>
+                <w:rFonts w:asciiTheme="majorHAnsi" w:hAnsiTheme="majorHAnsi" w:cs="Courier New"/>
+              </w:rPr>
+            </w:pPr>
+            <w:r>
+              <w:rPr>
+                <w:rFonts w:asciiTheme="majorHAnsi" w:hAnsiTheme="majorHAnsi" w:cs="Courier New"/>
+              </w:rPr>
+              <w:t>node3</w:t>
+            </w:r>
+          </w:p>
+        </w:tc>
+        <w:tc>
+          <w:tcPr>
+            <w:tcW w:w="0" w:type="auto"/>
+            <w:hideMark/>
+          </w:tcPr>
+          <w:p>
+            <w:pPr>
+              <w:spacing w:after="160" w:line="278" w:lineRule="auto"/>
+              <w:rPr>
+                <w:rFonts w:asciiTheme="majorHAnsi" w:hAnsiTheme="majorHAnsi" w:cs="Courier New"/>
+              </w:rPr>
+            </w:pPr>
+            <w:r>
+              <w:rPr>
+                <w:rFonts w:asciiTheme="majorHAnsi" w:hAnsiTheme="majorHAnsi" w:cs="Courier New"/>
+              </w:rPr>
+              <w:t>233</w:t>
+            </w:r>
+          </w:p>
+        </w:tc>
+        <w:tc>
+          <w:tcPr>
+            <w:tcW w:w="0" w:type="auto"/>
+            <w:hideMark/>
+          </w:tcPr>
+          <w:p>
+            <w:pPr>
+              <w:spacing w:after="160" w:line="278" w:lineRule="auto"/>
+              <w:rPr>
+                <w:rFonts w:asciiTheme="majorHAnsi" w:hAnsiTheme="majorHAnsi" w:cs="Courier New"/>
+              </w:rPr>
+            </w:pPr>
+            <w:r>
+              <w:rPr>
+                <w:rFonts w:asciiTheme="majorHAnsi" w:hAnsiTheme="majorHAnsi" w:cs="Courier New"/>
+              </w:rPr>
+              <w:t>50</w:t>
+            </w:r>
+          </w:p>
+        </w:tc>
+        <w:tc>
+          <w:tcPr>
+            <w:tcW w:w="0" w:type="auto"/>
+            <w:hideMark/>
+          </w:tcPr>
+          <w:p>
+            <w:pPr>
+              <w:spacing w:after="160" w:line="278" w:lineRule="auto"/>
+              <w:rPr>
+                <w:rFonts w:asciiTheme="majorHAnsi" w:hAnsiTheme="majorHAnsi" w:cs="Courier New"/>
+              </w:rPr>
+            </w:pPr>
+            <w:r>
+              <w:rPr>
+                <w:rFonts w:asciiTheme="majorHAnsi" w:hAnsiTheme="majorHAnsi" w:cs="Courier New"/>
+              </w:rPr>
+              <w:t>13.64%</w:t>
+            </w:r>
+          </w:p>
+        </w:tc>
+      </w:tr>
+      <w:tr>
+        <w:tc>
+          <w:tcPr>
+            <w:tcW w:w="0" w:type="auto"/>
+            <w:hideMark/>
+          </w:tcPr>
+          <w:p>
+            <w:pPr>
+              <w:spacing w:after="160" w:line="278" w:lineRule="auto"/>
+              <w:rPr>
+                <w:rFonts w:asciiTheme="majorHAnsi" w:hAnsiTheme="majorHAnsi" w:cs="Courier New"/>
+              </w:rPr>
+            </w:pPr>
+            <w:r>
+              <w:rPr>
+                <w:rFonts w:asciiTheme="majorHAnsi" w:hAnsiTheme="majorHAnsi" w:cs="Courier New"/>
+              </w:rPr>
+              <w:t>osd.3</w:t>
+            </w:r>
+          </w:p>
+        </w:tc>
+        <w:tc>
+          <w:tcPr>
+            <w:tcW w:w="0" w:type="auto"/>
+            <w:hideMark/>
+          </w:tcPr>
+          <w:p>
+            <w:pPr>
+              <w:spacing w:after="160" w:line="278" w:lineRule="auto"/>
+              <w:rPr>
+                <w:rFonts w:asciiTheme="majorHAnsi" w:hAnsiTheme="majorHAnsi" w:cs="Courier New"/>
+              </w:rPr>
+            </w:pPr>
+            <w:r>
+              <w:rPr>
+                <w:rFonts w:asciiTheme="majorHAnsi" w:hAnsiTheme="majorHAnsi" w:cs="Courier New"/>
+              </w:rPr>
+              <w:t>node2</w:t>
+            </w:r>
+          </w:p>
+        </w:tc>
+        <w:tc>
+          <w:tcPr>
+            <w:tcW w:w="0" w:type="auto"/>
+            <w:hideMark/>
+          </w:tcPr>
+          <w:p>
+            <w:pPr>
+              <w:spacing w:after="160" w:line="278" w:lineRule="auto"/>
+              <w:rPr>
+                <w:rFonts w:asciiTheme="majorHAnsi" w:hAnsiTheme="majorHAnsi" w:cs="Courier New"/>
+              </w:rPr>
+            </w:pPr>
+            <w:r>
+              <w:rPr>
+                <w:rFonts w:asciiTheme="majorHAnsi" w:hAnsiTheme="majorHAnsi" w:cs="Courier New"/>
+              </w:rPr>
+              <w:t>134</w:t>
+            </w:r>
+          </w:p>
+        </w:tc>
+        <w:tc>
+          <w:tcPr>
+            <w:tcW w:w="0" w:type="auto"/>
+            <w:hideMark/>
+          </w:tcPr>
+          <w:p>
+            <w:pPr>
+              <w:spacing w:after="160" w:line="278" w:lineRule="auto"/>
+              <w:rPr>
+                <w:rFonts w:asciiTheme="majorHAnsi" w:hAnsiTheme="majorHAnsi" w:cs="Courier New"/>
+              </w:rPr>
+            </w:pPr>
+            <w:r>
+              <w:rPr>
+                <w:rFonts w:asciiTheme="majorHAnsi" w:hAnsiTheme="majorHAnsi" w:cs="Courier New"/>
+              </w:rPr>
+              <w:t>56</w:t>
+            </w:r>
+          </w:p>
+        </w:tc>
+        <w:tc>
+          <w:tcPr>
+            <w:tcW w:w="0" w:type="auto"/>
+            <w:hideMark/>
+          </w:tcPr>
+          <w:p>
+            <w:pPr>
+              <w:spacing w:after="160" w:line="278" w:lineRule="auto"/>
+              <w:rPr>
+                <w:rFonts w:asciiTheme="majorHAnsi" w:hAnsiTheme="majorHAnsi" w:cs="Courier New"/>
+              </w:rPr>
+            </w:pPr>
+            <w:r>
+              <w:rPr>
+                <w:rFonts w:asciiTheme="majorHAnsi" w:hAnsiTheme="majorHAnsi" w:cs="Courier New"/>
+              </w:rPr>
+              <w:t>9.68%</w:t>
+            </w:r>
+          </w:p>
+        </w:tc>
+      </w:tr>
+      <w:tr>
+        <w:tc>
+          <w:tcPr>
+            <w:tcW w:w="0" w:type="auto"/>
+            <w:hideMark/>
+          </w:tcPr>
+          <w:p>
+            <w:pPr>
+              <w:spacing w:after="160" w:line="278" w:lineRule="auto"/>
+              <w:rPr>
+                <w:rFonts w:asciiTheme="majorHAnsi" w:hAnsiTheme="majorHAnsi" w:cs="Courier New"/>
+              </w:rPr>
+            </w:pPr>
+            <w:r>
+              <w:rPr>
+                <w:rFonts w:asciiTheme="majorHAnsi" w:hAnsiTheme="majorHAnsi" w:cs="Courier New"/>
+              </w:rPr>
+              <w:t>osd.4</w:t>
+            </w:r>
+          </w:p>
+        </w:tc>
+        <w:tc>
+          <w:tcPr>
+            <w:tcW w:w="0" w:type="auto"/>
+            <w:hideMark/>
+          </w:tcPr>
+          <w:p>
+            <w:pPr>
+              <w:spacing w:after="160" w:line="278" w:lineRule="auto"/>
+              <w:rPr>
+                <w:rFonts w:asciiTheme="majorHAnsi" w:hAnsiTheme="majorHAnsi" w:cs="Courier New"/>
+              </w:rPr>
+            </w:pPr>
+            <w:r>
+              <w:rPr>
+                <w:rFonts w:asciiTheme="majorHAnsi" w:hAnsiTheme="majorHAnsi" w:cs="Courier New"/>
+              </w:rPr>
+              <w:t>master</w:t>
+            </w:r>
+          </w:p>
+        </w:tc>
+        <w:tc>
+          <w:tcPr>
+            <w:tcW w:w="0" w:type="auto"/>
+            <w:hideMark/>
+          </w:tcPr>
+          <w:p>
+            <w:pPr>
+              <w:spacing w:after="160" w:line="278" w:lineRule="auto"/>
+              <w:rPr>
+                <w:rFonts w:asciiTheme="majorHAnsi" w:hAnsiTheme="majorHAnsi" w:cs="Courier New"/>
+              </w:rPr>
+            </w:pPr>
+            <w:r>
+              <w:rPr>
+                <w:rFonts w:asciiTheme="majorHAnsi" w:hAnsiTheme="majorHAnsi" w:cs="Courier New"/>
+              </w:rPr>
+              <w:t>112</w:t>
+            </w:r>
+          </w:p>
+        </w:tc>
+        <w:tc>
+          <w:tcPr>
+            <w:tcW w:w="0" w:type="auto"/>
+            <w:hideMark/>
+          </w:tcPr>
+          <w:p>
+            <w:pPr>
+              <w:spacing w:after="160" w:line="278" w:lineRule="auto"/>
+              <w:rPr>
+                <w:rFonts w:asciiTheme="majorHAnsi" w:hAnsiTheme="majorHAnsi" w:cs="Courier New"/>
+              </w:rPr>
+            </w:pPr>
+            <w:r>
+              <w:rPr>
+                <w:rFonts w:asciiTheme="majorHAnsi" w:hAnsiTheme="majorHAnsi" w:cs="Courier New"/>
+              </w:rPr>
+              <w:t>42</w:t>
+            </w:r>
+          </w:p>
+        </w:tc>
+        <w:tc>
+          <w:tcPr>
+            <w:tcW w:w="0" w:type="auto"/>
+            <w:hideMark/>
+          </w:tcPr>
+          <w:p>
+            <w:pPr>
+              <w:spacing w:after="160" w:line="278" w:lineRule="auto"/>
+              <w:rPr>
+                <w:rFonts w:asciiTheme="majorHAnsi" w:hAnsiTheme="majorHAnsi" w:cs="Courier New"/>
+              </w:rPr>
+            </w:pPr>
+            <w:r>
+              <w:rPr>
+                <w:rFonts w:asciiTheme="majorHAnsi" w:hAnsiTheme="majorHAnsi" w:cs="Courier New"/>
+              </w:rPr>
+              <w:t>9.58%</w:t>
+            </w:r>
+          </w:p>
+        </w:tc>
+      </w:tr>
+    </w:tbl>
+    <w:p>
+      <w:pPr>
+        <w:rPr>
+          <w:rFonts w:asciiTheme="majorHAnsi" w:hAnsiTheme="majorHAnsi" w:cs="Courier New"/>
+          <w:lang w:val="vi-VN"/>
+        </w:rPr>
+      </w:pPr>
     </w:p>
     <w:sectPr>
       <w:pgSz w:w="12240" w:h="15840"/>
@@ -1940,8 +2757,124 @@
       </w:pPr>
     </w:lvl>
   </w:abstractNum>
+  <w:abstractNum w:abstractNumId="1" w15:restartNumberingAfterBreak="0">
+    <w:nsid w:val="7D383326"/>
+    <w:multiLevelType w:val="hybridMultilevel"/>
+    <w:tmpl w:val="CDBE6C08"/>
+    <w:lvl w:ilvl="0" w:tplc="04090001">
+      <w:start w:val="1"/>
+      <w:numFmt w:val="bullet"/>
+      <w:lvlText w:val=""/>
+      <w:lvlJc w:val="left"/>
+      <w:pPr>
+        <w:ind w:left="720" w:hanging="360"/>
+      </w:pPr>
+      <w:rPr>
+        <w:rFonts w:ascii="Symbol" w:hAnsi="Symbol" w:hint="default"/>
+      </w:rPr>
+    </w:lvl>
+    <w:lvl w:ilvl="1" w:tplc="04090003" w:tentative="1">
+      <w:start w:val="1"/>
+      <w:numFmt w:val="bullet"/>
+      <w:lvlText w:val="o"/>
+      <w:lvlJc w:val="left"/>
+      <w:pPr>
+        <w:ind w:left="1440" w:hanging="360"/>
+      </w:pPr>
+      <w:rPr>
+        <w:rFonts w:ascii="Courier New" w:hAnsi="Courier New" w:cs="Courier New" w:hint="default"/>
+      </w:rPr>
+    </w:lvl>
+    <w:lvl w:ilvl="2" w:tplc="04090005" w:tentative="1">
+      <w:start w:val="1"/>
+      <w:numFmt w:val="bullet"/>
+      <w:lvlText w:val=""/>
+      <w:lvlJc w:val="left"/>
+      <w:pPr>
+        <w:ind w:left="2160" w:hanging="360"/>
+      </w:pPr>
+      <w:rPr>
+        <w:rFonts w:ascii="Wingdings" w:hAnsi="Wingdings" w:hint="default"/>
+      </w:rPr>
+    </w:lvl>
+    <w:lvl w:ilvl="3" w:tplc="04090001" w:tentative="1">
+      <w:start w:val="1"/>
+      <w:numFmt w:val="bullet"/>
+      <w:lvlText w:val=""/>
+      <w:lvlJc w:val="left"/>
+      <w:pPr>
+        <w:ind w:left="2880" w:hanging="360"/>
+      </w:pPr>
+      <w:rPr>
+        <w:rFonts w:ascii="Symbol" w:hAnsi="Symbol" w:hint="default"/>
+      </w:rPr>
+    </w:lvl>
+    <w:lvl w:ilvl="4" w:tplc="04090003" w:tentative="1">
+      <w:start w:val="1"/>
+      <w:numFmt w:val="bullet"/>
+      <w:lvlText w:val="o"/>
+      <w:lvlJc w:val="left"/>
+      <w:pPr>
+        <w:ind w:left="3600" w:hanging="360"/>
+      </w:pPr>
+      <w:rPr>
+        <w:rFonts w:ascii="Courier New" w:hAnsi="Courier New" w:cs="Courier New" w:hint="default"/>
+      </w:rPr>
+    </w:lvl>
+    <w:lvl w:ilvl="5" w:tplc="04090005" w:tentative="1">
+      <w:start w:val="1"/>
+      <w:numFmt w:val="bullet"/>
+      <w:lvlText w:val=""/>
+      <w:lvlJc w:val="left"/>
+      <w:pPr>
+        <w:ind w:left="4320" w:hanging="360"/>
+      </w:pPr>
+      <w:rPr>
+        <w:rFonts w:ascii="Wingdings" w:hAnsi="Wingdings" w:hint="default"/>
+      </w:rPr>
+    </w:lvl>
+    <w:lvl w:ilvl="6" w:tplc="04090001" w:tentative="1">
+      <w:start w:val="1"/>
+      <w:numFmt w:val="bullet"/>
+      <w:lvlText w:val=""/>
+      <w:lvlJc w:val="left"/>
+      <w:pPr>
+        <w:ind w:left="5040" w:hanging="360"/>
+      </w:pPr>
+      <w:rPr>
+        <w:rFonts w:ascii="Symbol" w:hAnsi="Symbol" w:hint="default"/>
+      </w:rPr>
+    </w:lvl>
+    <w:lvl w:ilvl="7" w:tplc="04090003" w:tentative="1">
+      <w:start w:val="1"/>
+      <w:numFmt w:val="bullet"/>
+      <w:lvlText w:val="o"/>
+      <w:lvlJc w:val="left"/>
+      <w:pPr>
+        <w:ind w:left="5760" w:hanging="360"/>
+      </w:pPr>
+      <w:rPr>
+        <w:rFonts w:ascii="Courier New" w:hAnsi="Courier New" w:cs="Courier New" w:hint="default"/>
+      </w:rPr>
+    </w:lvl>
+    <w:lvl w:ilvl="8" w:tplc="04090005" w:tentative="1">
+      <w:start w:val="1"/>
+      <w:numFmt w:val="bullet"/>
+      <w:lvlText w:val=""/>
+      <w:lvlJc w:val="left"/>
+      <w:pPr>
+        <w:ind w:left="6480" w:hanging="360"/>
+      </w:pPr>
+      <w:rPr>
+        <w:rFonts w:ascii="Wingdings" w:hAnsi="Wingdings" w:hint="default"/>
+      </w:rPr>
+    </w:lvl>
+  </w:abstractNum>
   <w:num w:numId="1" w16cid:durableId="116341277">
     <w:abstractNumId w:val="0"/>
+  </w:num>
+  <w:num w:numId="2" w16cid:durableId="1091203065">
+    <w:abstractNumId w:val="1"/>
   </w:num>
 </w:numbering>
 </file>
@@ -2548,7 +3481,6 @@
   <w:style w:type="character" w:default="1" w:styleId="DefaultParagraphFont">
     <w:name w:val="Default Paragraph Font"/>
     <w:uiPriority w:val="1"/>
-    <w:semiHidden/>
     <w:unhideWhenUsed/>
   </w:style>
   <w:style w:type="table" w:default="1" w:styleId="TableNormal">
@@ -2874,6 +3806,25 @@
       <w:szCs w:val="20"/>
     </w:rPr>
   </w:style>
+  <w:style w:type="table" w:styleId="TableGrid">
+    <w:name w:val="Table Grid"/>
+    <w:basedOn w:val="TableNormal"/>
+    <w:uiPriority w:val="39"/>
+    <w:rsid w:val="00EF6348"/>
+    <w:pPr>
+      <w:spacing w:after="0" w:line="240" w:lineRule="auto"/>
+    </w:pPr>
+    <w:tblPr>
+      <w:tblBorders>
+        <w:top w:val="single" w:sz="4" w:space="0" w:color="auto"/>
+        <w:left w:val="single" w:sz="4" w:space="0" w:color="auto"/>
+        <w:bottom w:val="single" w:sz="4" w:space="0" w:color="auto"/>
+        <w:right w:val="single" w:sz="4" w:space="0" w:color="auto"/>
+        <w:insideH w:val="single" w:sz="4" w:space="0" w:color="auto"/>
+        <w:insideV w:val="single" w:sz="4" w:space="0" w:color="auto"/>
+      </w:tblBorders>
+    </w:tblPr>
+  </w:style>
 </w:styles>
 </file>
 

</xml_diff>